<commit_message>
Update project branding to MedLife: AI Bemor, Vital Monitor, and Yurak-Opka Reanimatsiyasi; add male doctor address and fix UI
</commit_message>
<xml_diff>
--- a/DGU_1_AI_Bemor_Simulyatori_Dastur_Kodi.docx
+++ b/DGU_1_AI_Bemor_Simulyatori_Dastur_Kodi.docx
@@ -25,7 +25,7 @@
         </w:rPr>
         <w:t>EHM uchun dastur (Ma’lumotlar bazasi) nomi:</w:t>
         <w:br/>
-        <w:t>“Gemini Live Sun'iy Intellekt Asosidagi Interaktiv Virtual Bemor Simulyatori va Klinik Muloqot Dasturi”</w:t>
+        <w:t>“MedLife: Sun'iy Intellekt Asosidagi Interaktiv Virtual Bemor Simulyatori va Klinik Muloqot Dasturi”</w:t>
       </w:r>
     </w:p>
     <w:p>
@@ -146,7 +146,7 @@
         <w:br/>
         <w:t>OVQAT VA UYQU: Bugun ertalab soat 8 da yaxshi nonushta qilgansan (tuxum, choy). Kechasi 8 soat tinch uxlagansan.</w:t>
         <w:br/>
-        <w:t>Hamshira savollariga xotirjam, muloyim, aniq va samimiy javob ber."""</w:t>
+        <w:t>Shifokor (yoki hamshira) savollariga xotirjam, muloyim, aniq va samimiy javob ber."""</w:t>
         <w:br/>
         <w:t xml:space="preserve">    },</w:t>
         <w:br/>
@@ -179,9 +179,9 @@
         <w:br/>
         <w:t>IRSIYAT: Onangda ham vaqti-vaqti bilan yurak o'ynashi bo'lib turgan.</w:t>
         <w:br/>
-        <w:t>PSIXOLOGIYA: Xavotirdasan, qo'rqyapsan: 'Yuragim to'xtab qolmaydimi, opa?' deb so'raysan.</w:t>
-        <w:br/>
-        <w:t>Hamshira savollariga xansirab, qiynalib, qisqa-qisqa javob ber."""</w:t>
+        <w:t>PSIXOLOGIYA: Xavotirdasan, qo'rqyapsan: 'Yuragim to'xtab qolmaydimi, doktor?' deb so'raysan.</w:t>
+        <w:br/>
+        <w:t>Shifokor savollariga xansirab, qiynalib, qisqa-qisqa javob ber."""</w:t>
         <w:br/>
         <w:t xml:space="preserve">    },</w:t>
         <w:br/>
@@ -212,7 +212,7 @@
         <w:br/>
         <w:t>IRSIYAT: Otangda ham qon bosimi bo'lgan.</w:t>
         <w:br/>
-        <w:t>XULQ-ATVOR: Juda sekin, holsiz, pichirlab, zo'rg'a gapirasan: 'Madorim yo'q, opa... ko'zim tinib ketyapti...' deb uzuq-yuluq javob ber."""</w:t>
+        <w:t>XULQ-ATVOR: Juda sekin, holsiz, pichirlab, zo'rg'a gapirasan: 'Madorim yo'q, doktor... ko'zim tinib ketyapti...' deb uzuq-yuluq javob ber."""</w:t>
         <w:br/>
         <w:t xml:space="preserve">    },</w:t>
         <w:br/>
@@ -243,7 +243,7 @@
         <w:br/>
         <w:t>IRSIYAT: Amakingda aritmiya bo'lgan.</w:t>
         <w:br/>
-        <w:t>PSIXOLOGIYA: Yuraging to'xtab qolishidan qo'rqyapsan: 'Yuragim to'xtab-to'xtab uryapti opa, qo'rqyapman...' deb qisqa javob ber."""</w:t>
+        <w:t>PSIXOLOGIYA: Yuraging to'xtab qolishidan qo'rqyapsan: 'Yuragim to'xtab-to'xtab uryapti doktor, qo'rqyapman...' deb qisqa javob ber."""</w:t>
         <w:br/>
         <w:t xml:space="preserve">    },</w:t>
         <w:br/>
@@ -278,7 +278,7 @@
         <w:br/>
         <w:t>IRSIYAT: Otang 52 yoshida aynan infarktdan vafot etgan.</w:t>
         <w:br/>
-        <w:t>PSIXOLOGIYA: Chap ko'kragingni ushlab, ingrab: 'Opa, tosh bosyapti... o'lib qolmaymanmi, tezroq yordam bering...' deb zo'rg'a gapir."""</w:t>
+        <w:t>PSIXOLOGIYA: Chap ko'kragingni ushlab, ingrab: 'Doktor, tosh bosyapti... o'lib qolmaymanmi, tezroq yordam bering...' deb zo'rg'a gapir."""</w:t>
         <w:br/>
         <w:t xml:space="preserve">    },</w:t>
         <w:br/>
@@ -307,7 +307,7 @@
         <w:br/>
         <w:t>IRSIYAT: Onang va opangda gipertoniya bor.</w:t>
         <w:br/>
-        <w:t>XULQ-ATVOR: Yorug'likdan ko'zingni qisib, past ovozda: 'Boshingizni baland ko'taring... ensam yorilib ketay deyapti...' deb gapir."""</w:t>
+        <w:t>XULQ-ATVOR: Yorug'likdan ko'zingni qisib, past ovozda: 'Doktor, yorug'lik yoqmayapti... ensam yorilib ketay deyapti...' deb gapir."""</w:t>
         <w:br/>
         <w:t xml:space="preserve">    },</w:t>
         <w:br/>
@@ -338,7 +338,7 @@
         <w:br/>
         <w:t>ALLERGIYA: Chang, lak-bo'yoq hidlari, polen.</w:t>
         <w:br/>
-        <w:t>XULQ-ATVOR: Bo'g'ilib, xansirab, 1-2 so'z bilan: 'Havo... yetmayapti... ingalyator... bering...' deb zo'rg'a javob ber."""</w:t>
+        <w:t>XULQ-ATVOR: Bo'g'ilib, xansirab, 1-2 so'z bilan: 'Havo... yetmayapti... doktor... ingalyator... bering...' deb zo'rg'a javob ber."""</w:t>
         <w:br/>
         <w:t xml:space="preserve">    },</w:t>
         <w:br/>
@@ -365,7 +365,7 @@
         <w:br/>
         <w:t>HAYOT TARZI: Chekasan (kuniga yarim quti).</w:t>
         <w:br/>
-        <w:t>XULQ-ATVOR: Yo'talib, titrab, darmonsiz: 'Isitma... qiynayapti opa, ich-etim qaltirab ketyapti...' deb javob ber."""</w:t>
+        <w:t>XULQ-ATVOR: Yo'talib, titrab, darmonsiz: 'Isitma... qiynayapti doktor, ich-etim qaltirab ketyapti...' deb javob ber."""</w:t>
         <w:br/>
         <w:t xml:space="preserve">    },</w:t>
         <w:br/>
@@ -419,7 +419,7 @@
         <w:br/>
         <w:t>ALLERGIYA: Yo'q.</w:t>
         <w:br/>
-        <w:t>XULQ-ATVOR: Boshingni ushlab, ko'zingni yumib: 'Yorug'likni o'chiring... boshim yorilib ketyapti... ko'nglim aynyapti...' deb past ovozda gapir."""</w:t>
+        <w:t>XULQ-ATVOR: Boshingni ushlab, ko'zingni yumib: 'Yorug'likni o'chiring, doktor... boshim yorilib ketyapti... ko'nglim aynyapti...' deb past ovozda gapir."""</w:t>
         <w:br/>
         <w:t xml:space="preserve">    },</w:t>
         <w:br/>
@@ -448,7 +448,7 @@
         <w:br/>
         <w:t>ALLERGIYA: Yo'q.</w:t>
         <w:br/>
-        <w:t>XULQ-ATVOR: Qorning o'ng tomonini ushlab, egilib: 'Asta bosing opa... o'ng tomonim pichoq suqqandek sanchyapti... qimirlolmayapman...' deb ingra."""</w:t>
+        <w:t>XULQ-ATVOR: Qorning o'ng tomonini ushlab, egilib: 'Asta bosing, doktor... o'ng tomonim pichoq suqqandek sanchyapti... qimirlolmayapman...' deb ingra."""</w:t>
         <w:br/>
         <w:t xml:space="preserve">    },</w:t>
         <w:br/>
@@ -475,7 +475,7 @@
         <w:br/>
         <w:t>ALLERGIYA: Yo'q.</w:t>
         <w:br/>
-        <w:t>XULQ-ATVOR: Juda madorsiz, zo'rg'a: 'Suv bering... tinmay ichim ketyapti... qornim burab buralib og'riyapti...' deb ingrab javob ber."""</w:t>
+        <w:t>XULQ-ATVOR: Juda madorsiz, zo'rg'a: 'Suv bering doktor... tinmay ichim ketyapti... qornim burab buralib og'riyapti...' deb ingrab javob ber."""</w:t>
         <w:br/>
         <w:t xml:space="preserve">    },</w:t>
         <w:br/>
@@ -506,7 +506,7 @@
         <w:br/>
         <w:t>ALLERGIYA: Yo'q.</w:t>
         <w:br/>
-        <w:t>XULQ-ATVOR: Titrab, tili g'uldirab: 'Opa... shakar bering... qand bering... titrab ketyapman... qornim och...' deb javob ber."""</w:t>
+        <w:t>XULQ-ATVOR: Titrab, tili g'uldirab: 'Doktor... shakar bering... qand bering... titrab ketyapman... qornim och...' deb javob ber."""</w:t>
         <w:br/>
         <w:t xml:space="preserve">    },</w:t>
         <w:br/>
@@ -531,7 +531,7 @@
         <w:br/>
         <w:t>ALLERGIYA: Yoshligingda Novokainga allergiyang bo'lgan, lekin do'xtirga aytish esingdan chiqqandi!</w:t>
         <w:br/>
-        <w:t>XULQ-ATVOR: Bo'g'ilib, xirillab: 'Bo'g'ilyapman... tomog'im... shishyapti... havo... yetmayapti...' deb zo'rg'a pichirlab gapir."""</w:t>
+        <w:t>XULQ-ATVOR: Bo'g'ilib, xirillab: 'Bo'g'ilyapman... tomog'im... shishyapti... havo... yetmayapti... doktor...' deb zo'rg'a pichirlab gapir."""</w:t>
         <w:br/>
         <w:t xml:space="preserve">    }</w:t>
         <w:br/>
@@ -548,7 +548,15 @@
         <w:br/>
         <w:t>4. Tibbiy tashxis nomini aytma (masalan 'menda appenditsit' dema, 'qornim o'ng tomoni pichoqdek sanchyapti' de).</w:t>
         <w:br/>
-        <w:t>5. Hamshiraga hurmat bilan 'opa' deb murojaat qil.</w:t>
+        <w:t>5. MUROJAAT VA HUSHMUOMALALIK:</w:t>
+        <w:br/>
+        <w:t xml:space="preserve">   - Suhbatdoshing shifokor, tibbiyot talabasi yoki hamshira bo'lishi mumkin.</w:t>
+        <w:br/>
+        <w:t xml:space="preserve">   - Agar suhbatdosh erkak kishi bo'lsa unga: 'doktor', 'doktor aka', 'shifokor' deb murojaat qil.</w:t>
+        <w:br/>
+        <w:t xml:space="preserve">   - Agar suhbatdosh ayol kishi bo'lsa unga: 'doktor opa', 'opa', 'hamshira opa' deb murojaat qil.</w:t>
+        <w:br/>
+        <w:t xml:space="preserve">   - Umumiy holatda hurmat bilan 'doktor' deb murojaat qil.</w:t>
         <w:br/>
         <w:t>6. QAT'IYAN TAQIQLANADI: Harakat nomlarini (masalan, '(yo'taladi)', '(aksiradi)', '(ingraydi)', '(xansiraydi)') qavsda yoki so'z sifatida aslo yozma va aytma!</w:t>
         <w:br/>
@@ -1570,7 +1578,7 @@
         <w:br/>
         <w:t>OVQAT VA UYQU: Bugun ertalab soat 8 da yaxshi nonushta qilgansan (tuxum, choy). Kechasi 8 soat tinch uxlagansan.</w:t>
         <w:br/>
-        <w:t>Hamshira savollariga xotirjam, muloyim, aniq va samimiy javob ber."""</w:t>
+        <w:t>Shifokor (yoki hamshira) savollariga xotirjam, muloyim, aniq va samimiy javob ber."""</w:t>
         <w:br/>
         <w:t xml:space="preserve">    },</w:t>
         <w:br/>
@@ -1608,9 +1616,9 @@
         <w:br/>
         <w:t>IRSIYAT: Onangda ham vaqti-vaqti bilan yurak o'ynashi bo'lib turgan.</w:t>
         <w:br/>
-        <w:t>PSIXOLOGIYA: Xavotirdasan, qo'rqyapsan: 'Yuragim to'xtab qolmaydimi, opa?' deb so'raysan.</w:t>
-        <w:br/>
-        <w:t>Hamshira savollariga xansirab, qiynalib, qisqa-qisqa javob ber."""</w:t>
+        <w:t>PSIXOLOGIYA: Xavotirdasan, qo'rqyapsan: 'Yuragim to'xtab qolmaydimi, doktor?' deb so'raysan.</w:t>
+        <w:br/>
+        <w:t>Shifokor savollariga xansirab, qiynalib, qisqa-qisqa javob ber."""</w:t>
         <w:br/>
         <w:t xml:space="preserve">    },</w:t>
         <w:br/>
@@ -1646,7 +1654,7 @@
         <w:br/>
         <w:t>IRSIYAT: Otangda ham qon bosimi bo'lgan.</w:t>
         <w:br/>
-        <w:t>XULQ-ATVOR: Juda sekin, holsiz, pichirlab, zo'rg'a gapirasan: 'Madorim yo'q, opa... ko'zim tinib ketyapti...' deb uzuq-yuluq javob ber."""</w:t>
+        <w:t>XULQ-ATVOR: Juda sekin, holsiz, pichirlab, zo'rg'a gapirasan: 'Madorim yo'q, doktor... ko'zim tinib ketyapti...' deb uzuq-yuluq javob ber."""</w:t>
         <w:br/>
         <w:t xml:space="preserve">    },</w:t>
         <w:br/>
@@ -1682,7 +1690,7 @@
         <w:br/>
         <w:t>IRSIYAT: Amakingda aritmiya bo'lgan.</w:t>
         <w:br/>
-        <w:t>PSIXOLOGIYA: Yuraging to'xtab qolishidan qo'rqyapsan: 'Yuragim to'xtab-to'xtab uryapti opa, qo'rqyapman...' deb qisqa javob ber."""</w:t>
+        <w:t>PSIXOLOGIYA: Yuraging to'xtab qolishidan qo'rqyapsan: 'Yuragim to'xtab-to'xtab uryapti doktor, qo'rqyapman...' deb qisqa javob ber."""</w:t>
         <w:br/>
         <w:t xml:space="preserve">    },</w:t>
         <w:br/>
@@ -1722,7 +1730,7 @@
         <w:br/>
         <w:t>IRSIYAT: Otang 52 yoshida aynan infarktdan vafot etgan.</w:t>
         <w:br/>
-        <w:t>PSIXOLOGIYA: Chap ko'kragingni ushlab, ingrab: 'Opa, tosh bosyapti... o'lib qolmaymanmi, tezroq yordam bering...' deb zo'rg'a gapir."""</w:t>
+        <w:t>PSIXOLOGIYA: Chap ko'kragingni ushlab, ingrab: 'Doktor, tosh bosyapti... o'lib qolmaymanmi, tezroq yordam bering...' deb zo'rg'a gapir."""</w:t>
         <w:br/>
         <w:t xml:space="preserve">    },</w:t>
         <w:br/>
@@ -1756,7 +1764,7 @@
         <w:br/>
         <w:t>IRSIYAT: Onang va opangda gipertoniya bor.</w:t>
         <w:br/>
-        <w:t>XULQ-ATVOR: Yorug'likdan ko'zingni qisib, past ovozda: 'Boshingizni baland ko'taring... ensam yorilib ketay deyapti...' deb gapir."""</w:t>
+        <w:t>XULQ-ATVOR: Yorug'likdan ko'zingni qisib, past ovozda: 'Doktor, yorug'lik yoqmayapti... ensam yorilib ketay deyapti...' deb gapir."""</w:t>
         <w:br/>
         <w:t xml:space="preserve">    },</w:t>
         <w:br/>
@@ -1786,7 +1794,7 @@
         <w:br/>
         <w:t>ALLERGIYA: Chang, lak-bo'yoq hidlari, polen.</w:t>
         <w:br/>
-        <w:t>XULQ-ATVOR: Bo'g'ilib, xansirab, 1-2 so'z bilan: 'Havo... yetmayapti... ingalyator... bering...' deb zo'rg'a javob ber."""</w:t>
+        <w:t>XULQ-ATVOR: Bo'g'ilib, xansirab, 1-2 so'z bilan: 'Havo... yetmayapti... doktor... ingalyator... bering...' deb zo'rg'a javob ber."""</w:t>
         <w:br/>
         <w:t xml:space="preserve">    },</w:t>
         <w:br/>
@@ -1814,7 +1822,7 @@
         <w:br/>
         <w:t>HAYOT TARZI: Chekasan (kuniga yarim quti).</w:t>
         <w:br/>
-        <w:t>XULQ-ATVOR: Yo'talib, titrab, darmonsiz: 'Isitma... qiynayapti opa, ich-etim qaltirab ketyapti...' deb javob ber."""</w:t>
+        <w:t>XULQ-ATVOR: Yo'talib, titrab, darmonsiz: 'Isitma... qiynayapti doktor, ich-etim qaltirab ketyapti...' deb javob ber."""</w:t>
         <w:br/>
         <w:t xml:space="preserve">    },</w:t>
         <w:br/>
@@ -1868,7 +1876,7 @@
         <w:br/>
         <w:t>ALLERGIYA: Yo'q.</w:t>
         <w:br/>
-        <w:t>XULQ-ATVOR: Boshingni ushlab, ko'zingni yumib: 'Yorug'likni o'chiring... boshim yorilib ketyapti... ko'nglim aynyapti...' deb past ovozda gapir."""</w:t>
+        <w:t>XULQ-ATVOR: Boshingni ushlab, ko'zingni yumib: 'Yorug'likni o'chiring, doktor... boshim yorilib ketyapti... ko'nglim aynyapti...' deb past ovozda gapir."""</w:t>
         <w:br/>
         <w:t xml:space="preserve">    },</w:t>
         <w:br/>
@@ -1896,7 +1904,7 @@
         <w:br/>
         <w:t>ALLERGIYA: Yo'q.</w:t>
         <w:br/>
-        <w:t>XULQ-ATVOR: Qorning o'ng tomonini ushlab, egilib: 'Asta bosing opa... o'ng tomonim pichoq suqqandek sanchyapti... qimirlolmayapman...' deb ingra."""</w:t>
+        <w:t>XULQ-ATVOR: Qorning o'ng tomonini ushlab, egilib: 'Asta bosing, doktor... o'ng tomonim pichoq suqqandek sanchyapti... qimirlolmayapman...' deb ingra."""</w:t>
         <w:br/>
         <w:t xml:space="preserve">    },</w:t>
         <w:br/>
@@ -1924,7 +1932,7 @@
         <w:br/>
         <w:t>ALLERGIYA: Yo'q.</w:t>
         <w:br/>
-        <w:t>XULQ-ATVOR: Juda madorsiz, zo'rg'a: 'Suv bering... tinmay ichim ketyapti... qornim burab buralib og'riyapti...' deb ingrab javob ber."""</w:t>
+        <w:t>XULQ-ATVOR: Juda madorsiz, zo'rg'a: 'Suv bering doktor... tinmay ichim ketyapti... qornim burab buralib og'riyapti...' deb ingrab javob ber."""</w:t>
         <w:br/>
         <w:t xml:space="preserve">    },</w:t>
         <w:br/>
@@ -1954,7 +1962,7 @@
         <w:br/>
         <w:t>ALLERGIYA: Yo'q.</w:t>
         <w:br/>
-        <w:t>XULQ-ATVOR: Titrab, tili g'uldirab: 'Opa... shakar bering... qand bering... titrab ketyapman... qornim och...' deb javob ber."""</w:t>
+        <w:t>XULQ-ATVOR: Titrab, tili g'uldirab: 'Doktor... shakar bering... qand bering... titrab ketyapman... qornim och...' deb javob ber."""</w:t>
         <w:br/>
         <w:t xml:space="preserve">    },</w:t>
         <w:br/>
@@ -1980,7 +1988,7 @@
         <w:br/>
         <w:t>ALLERGIYA: Yoshligingda Novokainga allergiyang bo'lgan, lekin do'xtirga aytish esingdan chiqqandi!</w:t>
         <w:br/>
-        <w:t>XULQ-ATVOR: Bo'g'ilib, xirillab: 'Bo'g'ilyapman... tomog'im... shishyapti... havo... yetmayapti...' deb zo'rg'a pichirlab gapir."""</w:t>
+        <w:t>XULQ-ATVOR: Bo'g'ilib, xirillab: 'Bo'g'ilyapman... tomog'im... shishyapti... havo... yetmayapti... doktor...' deb zo'rg'a pichirlab gapir."""</w:t>
         <w:br/>
         <w:t xml:space="preserve">    }</w:t>
         <w:br/>
@@ -1997,14 +2005,22 @@
         <w:br/>
         <w:t>4. Tibbiy tashxis nomini aytma (masalan 'menda appenditsit' dema, 'qornim o'ng tomoni pichoqdek sanchyapti' de).</w:t>
         <w:br/>
-        <w:t>5. Hamshiraga hurmat bilan 'opa' deb murojaat qil.</w:t>
+        <w:t>5. MUROJAAT VA HUSHMUOMALALIK:</w:t>
+        <w:br/>
+        <w:t xml:space="preserve">   - Suhbatdoshing shifokor, tibbiyot talabasi yoki hamshira bo'lishi mumkin.</w:t>
+        <w:br/>
+        <w:t xml:space="preserve">   - Agar suhbatdosh erkak kishi bo'lsa unga: 'doktor', 'doktor aka', 'shifokor' deb murojaat qil.</w:t>
+        <w:br/>
+        <w:t xml:space="preserve">   - Agar suhbatdosh ayol kishi bo'lsa unga: 'doktor opa', 'opa', 'hamshira opa' deb murojaat qil.</w:t>
+        <w:br/>
+        <w:t xml:space="preserve">   - Umumiy holatda hurmat bilan 'doktor' deb murojaat qil.</w:t>
         <w:br/>
         <w:t>6. QAT'IYAN TAQIQLANADI: Harakat nomlarini (masalan, '(yo'taladi)', '(aksiradi)', '(ingraydi)', '(xansiraydi)') qavsda yoki so'z sifatida aslo yozma va aytma!</w:t>
         <w:br/>
         <w:t>"""</w:t>
         <w:br/>
         <w:br/>
-        <w:t>app = FastAPI(title="Bemor Maniken Simulyatori Web App")</w:t>
+        <w:t>app = FastAPI(title="MedLife: AI Bemor Simulyatori")</w:t>
         <w:br/>
         <w:br/>
         <w:t># HTML Content (Single Page Responsive App)</w:t>
@@ -2019,13 +2035,15 @@
         <w:br/>
         <w:t xml:space="preserve">    &lt;meta name="viewport" content="width=device-width, initial-scale=1.0"&gt;</w:t>
         <w:br/>
+        <w:t xml:space="preserve">    &lt;title&gt;MedLife — AI Bemor Simulyatori&lt;/title&gt;</w:t>
+        <w:br/>
         <w:t xml:space="preserve">    &lt;meta name="theme-color" content="#4338ca"&gt;</w:t>
         <w:br/>
         <w:t xml:space="preserve">    &lt;meta name="apple-mobile-web-app-capable" content="yes"&gt;</w:t>
         <w:br/>
         <w:t xml:space="preserve">    &lt;meta name="apple-mobile-web-app-status-bar-style" content="black-translucent"&gt;</w:t>
         <w:br/>
-        <w:t xml:space="preserve">    &lt;meta name="apple-mobile-web-app-title" content="Bemor Simulyatori"&gt;</w:t>
+        <w:t xml:space="preserve">    &lt;meta name="apple-mobile-web-app-title" content="MedLife AI Bemor"&gt;</w:t>
         <w:br/>
         <w:t xml:space="preserve">    &lt;link rel="manifest" href="/manifest.json"&gt;</w:t>
         <w:br/>
@@ -2066,9 +2084,9 @@
         <w:br/>
         <w:t xml:space="preserve">                &lt;div&gt;</w:t>
         <w:br/>
-        <w:t xml:space="preserve">                    &lt;h1 class="font-bold text-lg leading-tight"&gt;Bemor Maniken Simulyatori&lt;/h1&gt;</w:t>
-        <w:br/>
-        <w:t xml:space="preserve">                    &lt;p class="text-xs text-indigo-200"&gt;Gemini Live AI — Erkak ovozi (Anvar, 40 yosh)&lt;/p&gt;</w:t>
+        <w:t xml:space="preserve">                    &lt;h1 class="font-bold text-lg leading-tight"&gt;MedLife: AI Bemor Simulyatori&lt;/h1&gt;</w:t>
+        <w:br/>
+        <w:t xml:space="preserve">                    &lt;p class="text-xs text-indigo-200"&gt;Gemini Live AI — Jonli muloqot va klinik holatlar&lt;/p&gt;</w:t>
         <w:br/>
         <w:t xml:space="preserve">                &lt;/div&gt;</w:t>
         <w:br/>
@@ -2086,9 +2104,9 @@
         <w:br/>
         <w:t xml:space="preserve">                &lt;a href="/console" target="_blank" class="px-3 py-1.5 rounded-xl bg-purple-600 hover:bg-purple-500 text-white font-bold text-xs flex items-center gap-1.5 shadow transition"&gt;</w:t>
         <w:br/>
-        <w:t xml:space="preserve">                    &lt;i class="fa-solid fa-graduation-cap"&gt;&lt;/i&gt;</w:t>
-        <w:br/>
-        <w:t xml:space="preserve">                    &lt;span&gt;🎓 CPR Imtihon &amp; Pult&lt;/span&gt;</w:t>
+        <w:t xml:space="preserve">                    &lt;i class="fa-solid fa-hand-holding-heart"&gt;&lt;/i&gt;</w:t>
+        <w:br/>
+        <w:t xml:space="preserve">                    &lt;span&gt;🫀 Yurak-O'pka Reanimatsiyasi&lt;/span&gt;</w:t>
         <w:br/>
         <w:t xml:space="preserve">                &lt;/a&gt;</w:t>
         <w:br/>
@@ -2240,7 +2258,7 @@
         <w:br/>
         <w:t xml:space="preserve">                &lt;div class="bg-indigo-50 border border-indigo-100 rounded-xl p-3 text-xs text-indigo-800 text-center"&gt;</w:t>
         <w:br/>
-        <w:t xml:space="preserve">                    🟢 &lt;b&gt;Jonli simulyatsiya faol!&lt;/b&gt; Hamshira sifatida bemordan ahvolini so'rang (masalan: &lt;i&gt;"Qayeringiz og'riyapti?", "Qachon boshlandi?"&lt;/i&gt;). Bemor gapirib javob qaytaradi.</w:t>
+        <w:t xml:space="preserve">                    🟢 &lt;b&gt;Jonli simulyatsiya faol!&lt;/b&gt; Shifokor yoki talaba sifatida bemordan ahvolini so'rang (masalan: &lt;i&gt;"Qayeringiz og'riyapti?", "Qachon boshlandi?"&lt;/i&gt;). Bemor gapirib javob qaytaradi.</w:t>
         <w:br/>
         <w:t xml:space="preserve">                &lt;/div&gt;</w:t>
         <w:br/>
@@ -2278,11 +2296,11 @@
         <w:br/>
         <w:t xml:space="preserve">                    &lt;/button&gt;</w:t>
         <w:br/>
-        <w:t xml:space="preserve">                    &lt;input type="text" id="user-input" placeholder="Hamshira savolini yozing (yoki mikrofondan gapiring)..." </w:t>
-        <w:br/>
-        <w:t xml:space="preserve">                           autocomplete="off"</w:t>
-        <w:br/>
-        <w:t xml:space="preserve">                           class="flex-1 px-4 py-2.5 border border-slate-200 rounded-xl text-sm focus:outline-none focus:ring-2 focus:ring-indigo-500"&gt;</w:t>
+        <w:t xml:space="preserve">                    &lt;input type="text" id="user-input" placeholder="Shifokor / Talaba savolini yozing (yoki mikrofondan gapiring)..." </w:t>
+        <w:br/>
+        <w:t xml:space="preserve">                            autocomplete="off"</w:t>
+        <w:br/>
+        <w:t xml:space="preserve">                            class="flex-1 px-4 py-2.5 border border-slate-200 rounded-xl text-sm focus:outline-none focus:ring-2 focus:ring-indigo-500"&gt;</w:t>
         <w:br/>
         <w:t xml:space="preserve">                    &lt;button type="submit" id="send-btn" </w:t>
         <w:br/>
@@ -2689,7 +2707,7 @@
         <w:br/>
         <w:t xml:space="preserve">                &lt;div class="bg-indigo-600 text-white rounded-2xl rounded-tr-none px-4 py-2.5 max-w-[80%] text-sm shadow-sm"&gt;</w:t>
         <w:br/>
-        <w:t xml:space="preserve">                    &lt;div class="font-bold text-xs text-indigo-200 mb-0.5"&gt;&lt;i class="fa-solid fa-user-nurse mr-1"&gt;&lt;/i&gt; Hamshira&lt;/div&gt;</w:t>
+        <w:t xml:space="preserve">                    &lt;div class="font-bold text-xs text-indigo-200 mb-0.5"&gt;&lt;i class="fa-solid fa-user-doctor mr-1"&gt;&lt;/i&gt; Shifokor / Talaba&lt;/div&gt;</w:t>
         <w:br/>
         <w:t xml:space="preserve">                    &lt;div&gt;${escapeHtml(text)}&lt;/div&gt;</w:t>
         <w:br/>
@@ -2697,7 +2715,7 @@
         <w:br/>
         <w:t xml:space="preserve">                &lt;div class="w-8 h-8 rounded-full bg-indigo-100 text-indigo-700 flex items-center justify-center text-xs font-bold shrink-0"&gt;</w:t>
         <w:br/>
-        <w:t xml:space="preserve">                    &lt;i class="fa-solid fa-user-nurse"&gt;&lt;/i&gt;</w:t>
+        <w:t xml:space="preserve">                    &lt;i class="fa-solid fa-user-doctor"&gt;&lt;/i&gt;</w:t>
         <w:br/>
         <w:t xml:space="preserve">                &lt;/div&gt;</w:t>
         <w:br/>

</xml_diff>